<commit_message>
Allow optional second discussion topic
</commit_message>
<xml_diff>
--- a/templates/template.docx
+++ b/templates/template.docx
@@ -806,7 +806,7 @@
         <w:rPr>
           <w:lang w:eastAsia="ko-KR"/>
         </w:rPr>
-        <w:t>loop</w:t>
+        <w:t>topic</w:t>
       </w:r>
       <w:proofErr w:type="gramEnd"/>
       <w:r>
@@ -820,7 +820,7 @@
         <w:rPr>
           <w:lang w:eastAsia="ko-KR"/>
         </w:rPr>
-        <w:t>index</w:t>
+        <w:t>number</w:t>
       </w:r>
       <w:proofErr w:type="spellEnd"/>
       <w:r>

</xml_diff>